<commit_message>
docs: add authors and submission front matter to both manuscripts
Authors: Sree Vasthav Upputoori (corresponding) and S. Madhav Varma,
with affiliation and ORCID left as explicit placeholders.

Both manuscripts gain the sections journals require before submission:
author contributions as a CRediT-taxonomy template, funding, competing
interests, and a generative-AI use declaration. The contribution
statements are left for the authors to complete rather than drafted —
they are assertions about who did what, and inferring them from commit
metadata would be fabricating an authorship claim. The first author's
roles are sketched from what the repository evidences; the second
author's are marked for completion.

The docx converter gained superscript support, so author affiliation
markers render as real superscripts rather than literal <sup> tags.
</commit_message>
<xml_diff>
--- a/learning/research-track-R6-manuscript/WaweKit_standardization_reproducibility_manuscript.docx
+++ b/learning/research-track-R6-manuscript/WaweKit_standardization_reproducibility_manuscript.docx
@@ -9,6 +9,71 @@
       </w:pPr>
       <w:r>
         <w:t>Quantifying and attributing standardization reproducibility in cheminformatics pipelines</w:t>
+      </w:r>
+    </w:p>
+    <w:p>
+      <w:r>
+        <w:rPr>
+          <w:b/>
+        </w:rPr>
+        <w:t>Sree Vasthav Upputoori</w:t>
+      </w:r>
+      <w:r>
+        <w:rPr>
+          <w:vertAlign w:val="superscript"/>
+        </w:rPr>
+        <w:t>1,*</w:t>
+      </w:r>
+      <w:r>
+        <w:t xml:space="preserve"> and </w:t>
+      </w:r>
+      <w:r>
+        <w:rPr>
+          <w:b/>
+        </w:rPr>
+        <w:t>S. Madhav Varma</w:t>
+      </w:r>
+      <w:r>
+        <w:rPr>
+          <w:vertAlign w:val="superscript"/>
+        </w:rPr>
+        <w:t>1</w:t>
+      </w:r>
+    </w:p>
+    <w:p>
+      <w:r>
+        <w:rPr>
+          <w:vertAlign w:val="superscript"/>
+        </w:rPr>
+        <w:t>1</w:t>
+      </w:r>
+      <w:r>
+        <w:t xml:space="preserve"> TheWaweAI — </w:t>
+      </w:r>
+      <w:r>
+        <w:rPr>
+          <w:i/>
+        </w:rPr>
+        <w:t>affiliation address to be completed</w:t>
+      </w:r>
+    </w:p>
+    <w:p>
+      <w:r>
+        <w:rPr>
+          <w:vertAlign w:val="superscript"/>
+        </w:rPr>
+        <w:t>*</w:t>
+      </w:r>
+      <w:r>
+        <w:t xml:space="preserve"> Corresponding author: sreevasthav.upputoori@gmail.com</w:t>
+      </w:r>
+    </w:p>
+    <w:p>
+      <w:r>
+        <w:rPr>
+          <w:i/>
+        </w:rPr>
+        <w:t>ORCID identifiers to be added before submission.</w:t>
       </w:r>
     </w:p>
     <w:p>
@@ -5979,7 +6044,7 @@
         <w:pStyle w:val="Heading1"/>
       </w:pPr>
       <w:r>
-        <w:t>Author contributions, funding, competing interests</w:t>
+        <w:t>Author contributions</w:t>
       </w:r>
     </w:p>
     <w:p>
@@ -5987,7 +6052,88 @@
         <w:rPr>
           <w:i/>
         </w:rPr>
-        <w:t>To be completed by the author(s) before submission.</w:t>
+        <w:t>Template using the CRediT taxonomy — complete and amend to reflect the actual division of work. Contribution statements are assertions about who did what and must be written by the authors themselves, not inferred.</w:t>
+      </w:r>
+    </w:p>
+    <w:p>
+      <w:r>
+        <w:rPr>
+          <w:b/>
+        </w:rPr>
+        <w:t>Sree Vasthav Upputoori</w:t>
+      </w:r>
+      <w:r>
+        <w:t xml:space="preserve"> — Conceptualization; Methodology; Software; Investigation; Data curation; Writing – original draft; Visualization.</w:t>
+      </w:r>
+    </w:p>
+    <w:p>
+      <w:r>
+        <w:rPr>
+          <w:b/>
+        </w:rPr>
+        <w:t>S. Madhav Varma</w:t>
+      </w:r>
+      <w:r>
+        <w:t xml:space="preserve"> — </w:t>
+      </w:r>
+      <w:r>
+        <w:rPr>
+          <w:i/>
+        </w:rPr>
+        <w:t>roles to be specified.</w:t>
+      </w:r>
+    </w:p>
+    <w:p>
+      <w:r>
+        <w:t>Both authors read and approved the final manuscript.</w:t>
+      </w:r>
+    </w:p>
+    <w:p>
+      <w:pPr>
+        <w:pStyle w:val="Heading1"/>
+      </w:pPr>
+      <w:r>
+        <w:t>Funding</w:t>
+      </w:r>
+    </w:p>
+    <w:p>
+      <w:r>
+        <w:rPr>
+          <w:i/>
+        </w:rPr>
+        <w:t>To be completed. State any grant numbers, or declare that the work received no specific funding.</w:t>
+      </w:r>
+    </w:p>
+    <w:p>
+      <w:pPr>
+        <w:pStyle w:val="Heading1"/>
+      </w:pPr>
+      <w:r>
+        <w:t>Competing interests</w:t>
+      </w:r>
+    </w:p>
+    <w:p>
+      <w:r>
+        <w:rPr>
+          <w:i/>
+        </w:rPr>
+        <w:t>To be completed. Declare any competing interests, or state that the authors declare none.</w:t>
+      </w:r>
+    </w:p>
+    <w:p>
+      <w:pPr>
+        <w:pStyle w:val="Heading1"/>
+      </w:pPr>
+      <w:r>
+        <w:t>Declaration of generative AI use</w:t>
+      </w:r>
+    </w:p>
+    <w:p>
+      <w:r>
+        <w:rPr>
+          <w:i/>
+        </w:rPr>
+        <w:t>To be completed by the authors. Journals increasingly require disclosure of generative-AI assistance in preparing a manuscript or its accompanying software; check the target journal's current policy and describe the nature and extent of any such use.</w:t>
       </w:r>
     </w:p>
     <w:p/>

</xml_diff>

<commit_message>
docs: specify S. Madhav Varma's author contributions
Methodology, Software, and Writing - original draft, in both manuscripts.
</commit_message>
<xml_diff>
--- a/learning/research-track-R6-manuscript/WaweKit_standardization_reproducibility_manuscript.docx
+++ b/learning/research-track-R6-manuscript/WaweKit_standardization_reproducibility_manuscript.docx
@@ -6074,13 +6074,7 @@
         <w:t>S. Madhav Varma</w:t>
       </w:r>
       <w:r>
-        <w:t xml:space="preserve"> — </w:t>
-      </w:r>
-      <w:r>
-        <w:rPr>
-          <w:i/>
-        </w:rPr>
-        <w:t>roles to be specified.</w:t>
+        <w:t xml:space="preserve"> — Methodology; Software; Writing – original draft.</w:t>
       </w:r>
     </w:p>
     <w:p>

</xml_diff>